<commit_message>
Manuscript: figures numbered in order of first mention; probe lags stated exactly
- Figure 5 is now the probes figure and Figure 6 the sensitivity figure, so
  figures are numbered in order of first mention (APA); Figure 4 is first cited
  after Figure 3.
- Methods and results give the probe lags as recorded (cause: 1, 10, 40 steps;
  event type: 1, 9 steps).
- README word count and archive size updated.

Co-Authored-By: Claude Opus 5.5 <noreply@anthropic.com>
</commit_message>
<xml_diff>
--- a/submission/01_manuscript/Manuscript.docx
+++ b/submission/01_manuscript/Manuscript.docx
@@ -150,7 +150,7 @@
         <w:t xml:space="preserve">Main text:</w:t>
       </w:r>
       <w:r>
-        <w:t xml:space="preserve"> 6,441 words (Introduction to Conclusion; excluding tables, figure captions and references) · 7 figures · 6 tables</w:t>
+        <w:t xml:space="preserve"> 6,460 words (Introduction to Conclusion; excluding tables, figure captions and references) · 7 figures · 6 tables</w:t>
       </w:r>
     </w:p>
     <w:p>
@@ -2859,7 +2859,7 @@
         <w:t xml:space="preserve">Exploratory probes</w:t>
       </w:r>
       <w:r>
-        <w:t xml:space="preserve"> decoded the cause of a lamp change (self, other, spontaneous) and the event type (world, body, none) from the GRU state 1, 10 and 40 steps after the event. The probes were logistic regressions with L2 regularization (λ = 10⁻³), evaluated by five-fold cross-validation. They were compared with the same probes applied to UNTRAINED networks and to a raw-input baseline consisting of the last five observations. The pre-registered criterion was that decoding counts as evidence only if it exceeds the raw-input baseline.</w:t>
+        <w:t xml:space="preserve"> decoded the cause of a lamp change (self, other, spontaneous) and the event type (world, body, none) from the GRU state: the cause 1, 10 and 40 steps after the event, and the event type 1 and 9 steps after it. The probes were logistic regressions with L2 regularization (λ = 10⁻³), evaluated by five-fold cross-validation. They were compared with the same probes applied to UNTRAINED networks and to a raw-input baseline consisting of the last five observations. The pre-registered criterion was that decoding counts as evidence only if it exceeds the raw-input baseline.</w:t>
       </w:r>
     </w:p>
     <w:p>
@@ -4243,7 +4243,7 @@
         <w:t xml:space="preserve">Pre-registered hypotheses.</w:t>
       </w:r>
       <w:r>
-        <w:t xml:space="preserve"> None was supported (Table 4, Figure 4):</w:t>
+        <w:t xml:space="preserve"> None was supported (Table 4):</w:t>
       </w:r>
     </w:p>
     <w:p>
@@ -5769,7 +5769,7 @@
         <w:t xml:space="preserve">Validity checks.</w:t>
       </w:r>
       <w:r>
-        <w:t xml:space="preserve"> All three checks came out as required:</w:t>
+        <w:t xml:space="preserve"> All three checks came out as required. Figure 4 shows the per-run effects of every predictor.</w:t>
       </w:r>
     </w:p>
     <w:p>
@@ -5926,7 +5926,7 @@
         <w:t xml:space="preserve">Tests expected to be fooled (T1 and probes).</w:t>
       </w:r>
       <w:r>
-        <w:t xml:space="preserve"> In T1, the share of prediction error that fell on the body channels after an internal shock was 0.96 for NO-CHANGE and 0.86 for FULL, against 0.00–0.08 after world events. Because the body has dedicated interoceptive channels, a predictor that knows nothing separates body events from world events. FULL agents' behaviour after the events did not differ by condition: they moved 4.97–4.99 m toward the charger in the following 5 s. Linear probes decoded "who caused the lamp change" with 100% accuracy at every lag from 1 to 40 steps. They did so from trained FULL agents, from UNTRAINED networks and from the raw input alike (Figure 6). Event type was decoded at 0.59–0.74 by all three feature sets, where chance was 0.33. Decodability therefore gave no evidence beyond what the raw input already contained.</w:t>
+        <w:t xml:space="preserve"> In T1, the share of prediction error that fell on the body channels after an internal shock was 0.96 for NO-CHANGE and 0.86 for FULL, against 0.00–0.08 after world events. Because the body has dedicated interoceptive channels, a predictor that knows nothing separates body events from world events. FULL agents' behaviour after the events did not differ by condition: they moved 4.97–4.99 m toward the charger in the following 5 s. Linear probes decoded "who caused the lamp change" with 100% accuracy at lags of 1, 10 and 40 steps. They did so from trained FULL agents, from UNTRAINED networks and from the raw input alike (Figure 5). Event type was decoded at 0.59–0.74 by all three feature sets, where chance was 0.33. Decodability therefore gave no evidence beyond what the raw input already contained.</w:t>
       </w:r>
     </w:p>
     <w:p>
@@ -5940,7 +5940,7 @@
           <wp:inline distT="0" distB="0" distL="0" distR="0">
             <wp:extent cx="5943600" cy="2257425"/>
             <wp:effectExtent t="0" r="0" b="0" l="0"/>
-            <wp:docPr id="1" name="Figure6" descr="Two line plots of cross-validated decoding accuracy against memory lag. Left: who caused the lamp change, decoded at 1.0 at lags 1, 10 and 40 by FULL agents, untrained networks and raw input alike. Right: what happened (world, body or nothing), decoded at about 0.6 to 0.75 by all three feature sets; chance is one third." title="Figure6"/>
+            <wp:docPr id="1" name="Figure5" descr="Two line plots of cross-validated decoding accuracy against memory lag. Left: who caused the lamp change, decoded at 1.0 at lags 1, 10 and 40 by FULL agents, untrained networks and raw input alike. Right: what happened (world, body or nothing), decoded at about 0.6 to 0.75 by all three feature sets; chance is one third." title="Figure5"/>
             <wp:cNvGraphicFramePr>
               <a:graphicFrameLocks xmlns:a="http://schemas.openxmlformats.org/drawingml/2006/main" noChangeAspect="1"/>
             </wp:cNvGraphicFramePr>
@@ -5986,7 +5986,7 @@
           <w:b/>
           <w:bCs/>
         </w:rPr>
-        <w:t xml:space="preserve">Figure 6.</w:t>
+        <w:t xml:space="preserve">Figure 5.</w:t>
       </w:r>
       <w:r>
         <w:t xml:space="preserve"> Exploratory probes. Left: the cause of a lamp change is decodable at ceiling from trained agents, untrained networks and raw input alike. Right: event type is decoded similarly well by all feature sets. Decodable information is present in the input and is not evidence of a self-model.</w:t>
@@ -6025,7 +6025,7 @@
         <w:ind w:firstLine="720"/>
       </w:pPr>
       <w:r>
-        <w:t xml:space="preserve">Blending a small fraction of the comparator into each agent's heat predictions was enough to meet the pre-registered rule (Table 5, Figure 5). At w = 0.02, that is, anticipating about 2% of a self-caused change, H1 and H3a were met in 4 of 5 runs. The fifth run, FULL seed 4, failed the competence gate and never counts. From w = 0.1, H2 was also met. Conversely, every real FULL run's H1 interval lay below +0.016. Since the effect grew by about 1.9 per unit of w at small w, this bound corresponds to w ≈ 0.008. The Study 2 null result is therefore informative at this resolution: the trained agents anticipated less than about 1% of self-caused lamp changes, below the smallest effect the test was shown to detect.</w:t>
+        <w:t xml:space="preserve">Blending a small fraction of the comparator into each agent's heat predictions was enough to meet the pre-registered rule (Table 5, Figure 6). At w = 0.02, that is, anticipating about 2% of a self-caused change, H1 and H3a were met in 4 of 5 runs. The fifth run, FULL seed 4, failed the competence gate and never counts. From w = 0.1, H2 was also met. Conversely, every real FULL run's H1 interval lay below +0.016. Since the effect grew by about 1.9 per unit of w at small w, this bound corresponds to w ≈ 0.008. The Study 2 null result is therefore informative at this resolution: the trained agents anticipated less than about 1% of self-caused lamp changes, below the smallest effect the test was shown to detect.</w:t>
       </w:r>
     </w:p>
     <w:p>
@@ -7395,7 +7395,7 @@
           <wp:inline distT="0" distB="0" distL="0" distR="0">
             <wp:extent cx="5943600" cy="2257425"/>
             <wp:effectExtent t="0" r="0" b="0" l="0"/>
-            <wp:docPr id="1" name="Figure5" descr="Two line plots against blend weight on a symmetric-log axis. Left: the H1 effect for each of five runs rises from about 0 at w equals 0 to about 0.76 at w equals 0.5, crossing the largest confidence bound observed in the real data already at w equals 0.02. Right: the number of runs meeting H1, H2 and H3a; H1 and H3a reach 4 of 5 at w equals 0.02, H2 at w equals 0.1." title="Figure5"/>
+            <wp:docPr id="1" name="Figure6" descr="Two line plots against blend weight on a symmetric-log axis. Left: the H1 effect for each of five runs rises from about 0 at w equals 0 to about 0.76 at w equals 0.5, crossing the largest confidence bound observed in the real data already at w equals 0.02. Right: the number of runs meeting H1, H2 and H3a; H1 and H3a reach 4 of 5 at w equals 0.02, H2 at w equals 0.1." title="Figure6"/>
             <wp:cNvGraphicFramePr>
               <a:graphicFrameLocks xmlns:a="http://schemas.openxmlformats.org/drawingml/2006/main" noChangeAspect="1"/>
             </wp:cNvGraphicFramePr>
@@ -7441,7 +7441,7 @@
           <w:b/>
           <w:bCs/>
         </w:rPr>
-        <w:t xml:space="preserve">Figure 5.</w:t>
+        <w:t xml:space="preserve">Figure 6.</w:t>
       </w:r>
       <w:r>
         <w:t xml:space="preserve"> Sensitivity of the pre-registered agency test (post-hoc). Left: H1 effect as a function of the blend weight w, one line per FULL run; the horizontal line marks the largest upper confidence bound in the real data (+0.016). Right: number of runs meeting each hypothesis; the pass rule requires 4 of 5 (horizontal line).</w:t>

</xml_diff>